<commit_message>
Add cell width implementation and add standarf ways to know siblings pos
</commit_message>
<xml_diff>
--- a/tests/examples/tables.docx
+++ b/tests/examples/tables.docx
@@ -9,69 +9,72 @@
         <w:tblLook w:val="04A0" w:firstRow="1" w:lastRow="0" w:firstColumn="1" w:lastColumn="0" w:noHBand="0" w:noVBand="1"/>
       </w:tblPr>
       <w:tblGrid>
-        <w:gridCol w:w="2336"/>
-        <w:gridCol w:w="2336"/>
-        <w:gridCol w:w="2336"/>
-        <w:gridCol w:w="2337"/>
+        <w:gridCol w:w="4672"/>
+        <w:gridCol w:w="4673"/>
       </w:tblGrid>
       <w:tr>
-        <w:trPr>
-          <w:trHeight w:val="296"/>
-        </w:trPr>
         <w:tc>
           <w:tcPr>
-            <w:tcW w:w="2336" w:type="dxa"/>
-            <w:vMerge w:val="restart"/>
-            <w:tcBorders>
-              <w:bottom w:val="single" w:sz="4" w:space="0" w:color="auto"/>
-            </w:tcBorders>
+            <w:tcW w:w="4672" w:type="dxa"/>
           </w:tcPr>
-          <w:p/>
+          <w:p>
+            <w:pPr>
+              <w:rPr>
+                <w:lang w:val="en-US"/>
+              </w:rPr>
+            </w:pPr>
+            <w:r>
+              <w:rPr>
+                <w:lang w:val="en-US"/>
+              </w:rPr>
+              <w:t>With restart right next</w:t>
+            </w:r>
+          </w:p>
         </w:tc>
         <w:tc>
           <w:tcPr>
-            <w:tcW w:w="4672" w:type="dxa"/>
-            <w:gridSpan w:val="2"/>
-            <w:tcBorders>
-              <w:bottom w:val="single" w:sz="4" w:space="0" w:color="auto"/>
-            </w:tcBorders>
+            <w:tcW w:w="4673" w:type="dxa"/>
+            <w:vMerge w:val="restart"/>
           </w:tcPr>
-          <w:p/>
-        </w:tc>
-        <w:tc>
-          <w:tcPr>
-            <w:tcW w:w="2337" w:type="dxa"/>
-            <w:vMerge w:val="restart"/>
-            <w:tcBorders>
-              <w:bottom w:val="single" w:sz="4" w:space="0" w:color="auto"/>
-            </w:tcBorders>
-          </w:tcPr>
-          <w:p/>
+          <w:p>
+            <w:pPr>
+              <w:rPr>
+                <w:lang w:val="en-US"/>
+              </w:rPr>
+            </w:pPr>
+            <w:r>
+              <w:rPr>
+                <w:lang w:val="en-US"/>
+              </w:rPr>
+              <w:t>Vert merge</w:t>
+            </w:r>
+            <w:bookmarkStart w:id="0" w:name="_GoBack"/>
+            <w:bookmarkEnd w:id="0"/>
+          </w:p>
         </w:tc>
       </w:tr>
       <w:tr>
         <w:tc>
           <w:tcPr>
-            <w:tcW w:w="2336" w:type="dxa"/>
-            <w:vMerge/>
+            <w:tcW w:w="4672" w:type="dxa"/>
           </w:tcPr>
-          <w:p/>
+          <w:p>
+            <w:pPr>
+              <w:rPr>
+                <w:lang w:val="en-US"/>
+              </w:rPr>
+            </w:pPr>
+            <w:r>
+              <w:rPr>
+                <w:lang w:val="en-US"/>
+              </w:rPr>
+              <w:t>Only one</w:t>
+            </w:r>
+          </w:p>
         </w:tc>
         <w:tc>
           <w:tcPr>
-            <w:tcW w:w="2336" w:type="dxa"/>
-          </w:tcPr>
-          <w:p/>
-        </w:tc>
-        <w:tc>
-          <w:tcPr>
-            <w:tcW w:w="2336" w:type="dxa"/>
-          </w:tcPr>
-          <w:p/>
-        </w:tc>
-        <w:tc>
-          <w:tcPr>
-            <w:tcW w:w="2337" w:type="dxa"/>
+            <w:tcW w:w="4673" w:type="dxa"/>
             <w:vMerge/>
           </w:tcPr>
           <w:p/>
@@ -80,34 +83,26 @@
       <w:tr>
         <w:tc>
           <w:tcPr>
-            <w:tcW w:w="2336" w:type="dxa"/>
+            <w:tcW w:w="9345" w:type="dxa"/>
+            <w:gridSpan w:val="2"/>
           </w:tcPr>
-          <w:p/>
-        </w:tc>
-        <w:tc>
-          <w:tcPr>
-            <w:tcW w:w="2336" w:type="dxa"/>
-          </w:tcPr>
-          <w:p/>
-        </w:tc>
-        <w:tc>
-          <w:tcPr>
-            <w:tcW w:w="2336" w:type="dxa"/>
-          </w:tcPr>
-          <w:p/>
-        </w:tc>
-        <w:tc>
-          <w:tcPr>
-            <w:tcW w:w="2337" w:type="dxa"/>
-          </w:tcPr>
-          <w:p/>
+          <w:p>
+            <w:pPr>
+              <w:rPr>
+                <w:lang w:val="en-US"/>
+              </w:rPr>
+            </w:pPr>
+            <w:r>
+              <w:rPr>
+                <w:lang w:val="en-US"/>
+              </w:rPr>
+              <w:t>Grid span</w:t>
+            </w:r>
+          </w:p>
         </w:tc>
       </w:tr>
     </w:tbl>
-    <w:p>
-      <w:bookmarkStart w:id="0" w:name="_GoBack"/>
-      <w:bookmarkEnd w:id="0"/>
-    </w:p>
+    <w:p/>
     <w:sectPr>
       <w:pgSz w:w="11906" w:h="16838"/>
       <w:pgMar w:top="1134" w:right="850" w:bottom="1134" w:left="1701" w:header="708" w:footer="708" w:gutter="0"/>

</xml_diff>

<commit_message>
Fix bug with table grid
</commit_message>
<xml_diff>
--- a/tests/examples/tables.docx
+++ b/tests/examples/tables.docx
@@ -9,13 +9,14 @@
         <w:tblLook w:val="04A0" w:firstRow="1" w:lastRow="0" w:firstColumn="1" w:lastColumn="0" w:noHBand="0" w:noVBand="1"/>
       </w:tblPr>
       <w:tblGrid>
-        <w:gridCol w:w="4672"/>
-        <w:gridCol w:w="4673"/>
+        <w:gridCol w:w="3195"/>
+        <w:gridCol w:w="3184"/>
+        <w:gridCol w:w="2966"/>
       </w:tblGrid>
       <w:tr>
         <w:tc>
           <w:tcPr>
-            <w:tcW w:w="4672" w:type="dxa"/>
+            <w:tcW w:w="3195" w:type="dxa"/>
           </w:tcPr>
           <w:p>
             <w:pPr>
@@ -33,7 +34,7 @@
         </w:tc>
         <w:tc>
           <w:tcPr>
-            <w:tcW w:w="4673" w:type="dxa"/>
+            <w:tcW w:w="3184" w:type="dxa"/>
             <w:vMerge w:val="restart"/>
           </w:tcPr>
           <w:p>
@@ -48,15 +49,25 @@
               </w:rPr>
               <w:t>Vert merge</w:t>
             </w:r>
-            <w:bookmarkStart w:id="0" w:name="_GoBack"/>
-            <w:bookmarkEnd w:id="0"/>
+          </w:p>
+        </w:tc>
+        <w:tc>
+          <w:tcPr>
+            <w:tcW w:w="2966" w:type="dxa"/>
+          </w:tcPr>
+          <w:p>
+            <w:pPr>
+              <w:rPr>
+                <w:lang w:val="en-US"/>
+              </w:rPr>
+            </w:pPr>
           </w:p>
         </w:tc>
       </w:tr>
       <w:tr>
         <w:tc>
           <w:tcPr>
-            <w:tcW w:w="4672" w:type="dxa"/>
+            <w:tcW w:w="3195" w:type="dxa"/>
           </w:tcPr>
           <w:p>
             <w:pPr>
@@ -74,8 +85,14 @@
         </w:tc>
         <w:tc>
           <w:tcPr>
-            <w:tcW w:w="4673" w:type="dxa"/>
+            <w:tcW w:w="3184" w:type="dxa"/>
             <w:vMerge/>
+          </w:tcPr>
+          <w:p/>
+        </w:tc>
+        <w:tc>
+          <w:tcPr>
+            <w:tcW w:w="2966" w:type="dxa"/>
           </w:tcPr>
           <w:p/>
         </w:tc>
@@ -83,7 +100,7 @@
       <w:tr>
         <w:tc>
           <w:tcPr>
-            <w:tcW w:w="9345" w:type="dxa"/>
+            <w:tcW w:w="6379" w:type="dxa"/>
             <w:gridSpan w:val="2"/>
           </w:tcPr>
           <w:p>
@@ -100,9 +117,24 @@
             </w:r>
           </w:p>
         </w:tc>
+        <w:tc>
+          <w:tcPr>
+            <w:tcW w:w="2966" w:type="dxa"/>
+          </w:tcPr>
+          <w:p>
+            <w:pPr>
+              <w:rPr>
+                <w:lang w:val="en-US"/>
+              </w:rPr>
+            </w:pPr>
+          </w:p>
+        </w:tc>
       </w:tr>
     </w:tbl>
-    <w:p/>
+    <w:p>
+      <w:bookmarkStart w:id="0" w:name="_GoBack"/>
+      <w:bookmarkEnd w:id="0"/>
+    </w:p>
     <w:sectPr>
       <w:pgSz w:w="11906" w:h="16838"/>
       <w:pgMar w:top="1134" w:right="850" w:bottom="1134" w:left="1701" w:header="708" w:footer="708" w:gutter="0"/>

</xml_diff>

<commit_message>
types for resolve cell
</commit_message>
<xml_diff>
--- a/tests/examples/tables.docx
+++ b/tests/examples/tables.docx
@@ -6,14 +6,18 @@
       <w:tblPr>
         <w:tblStyle w:val="a3"/>
         <w:tblW w:w="5000" w:type="pct"/>
+        <w:tblCellSpacing w:w="11" w:type="dxa"/>
         <w:tblLook w:val="04A0" w:firstRow="1" w:lastRow="0" w:firstColumn="1" w:lastColumn="0" w:noHBand="0" w:noVBand="1"/>
       </w:tblPr>
       <w:tblGrid>
-        <w:gridCol w:w="2263"/>
-        <w:gridCol w:w="4116"/>
-        <w:gridCol w:w="2966"/>
+        <w:gridCol w:w="2275"/>
+        <w:gridCol w:w="4099"/>
+        <w:gridCol w:w="2971"/>
       </w:tblGrid>
       <w:tr>
+        <w:trPr>
+          <w:tblCellSpacing w:w="11" w:type="dxa"/>
+        </w:trPr>
         <w:tc>
           <w:tcPr>
             <w:tcW w:w="1211" w:type="pct"/>
@@ -65,6 +69,9 @@
         </w:tc>
       </w:tr>
       <w:tr>
+        <w:trPr>
+          <w:tblCellSpacing w:w="11" w:type="dxa"/>
+        </w:trPr>
         <w:tc>
           <w:tcPr>
             <w:tcW w:w="1211" w:type="pct"/>
@@ -98,6 +105,9 @@
         </w:tc>
       </w:tr>
       <w:tr>
+        <w:trPr>
+          <w:tblCellSpacing w:w="11" w:type="dxa"/>
+        </w:trPr>
         <w:tc>
           <w:tcPr>
             <w:tcW w:w="3413" w:type="pct"/>

</xml_diff>